<commit_message>
feat: improve contact flow recovery and face lost notice
- handle ambiguous contact replies like repeat list, need help, and more options
- add candidate pagination for showing alternate employee matches
- prevent visitor goal from being filled while waiting for visitor name
- preserve candidate session state in contact flow
- show a kiosk notice when face detection is lost
- update virtual receptionist work hours knowledge document
</commit_message>
<xml_diff>
--- a/knowledge/vr_location_work_hours.docx
+++ b/knowledge/vr_location_work_hours.docx
@@ -1,6 +1,6 @@
 
 <file path=word/document.xml><?xml version="1.0" encoding="utf-8"?>
-<w:document xmlns:wpc="http://schemas.microsoft.com/office/word/2010/wordprocessingCanvas" xmlns:cx="http://schemas.microsoft.com/office/drawing/2014/chartex" xmlns:cx1="http://schemas.microsoft.com/office/drawing/2015/9/8/chartex" xmlns:cx2="http://schemas.microsoft.com/office/drawing/2015/10/21/chartex" xmlns:cx3="http://schemas.microsoft.com/office/drawing/2016/5/9/chartex" xmlns:cx4="http://schemas.microsoft.com/office/drawing/2016/5/10/chartex" xmlns:cx5="http://schemas.microsoft.com/office/drawing/2016/5/11/chartex" xmlns:cx6="http://schemas.microsoft.com/office/drawing/2016/5/12/chartex" xmlns:cx7="http://schemas.microsoft.com/office/drawing/2016/5/13/chartex" xmlns:cx8="http://schemas.microsoft.com/office/drawing/2016/5/14/chartex" xmlns:mc="http://schemas.openxmlformats.org/markup-compatibility/2006" xmlns:aink="http://schemas.microsoft.com/office/drawing/2016/ink" xmlns:am3d="http://schemas.microsoft.com/office/drawing/2017/model3d" xmlns:o="urn:schemas-microsoft-com:office:office" xmlns:r="http://schemas.openxmlformats.org/officeDocument/2006/relationships" xmlns:m="http://schemas.openxmlformats.org/officeDocument/2006/math" xmlns:v="urn:schemas-microsoft-com:vml" xmlns:wp14="http://schemas.microsoft.com/office/word/2010/wordprocessingDrawing" xmlns:wp="http://schemas.openxmlformats.org/drawingml/2006/wordprocessingDrawing" xmlns:w10="urn:schemas-microsoft-com:office:word" xmlns:w="http://schemas.openxmlformats.org/wordprocessingml/2006/main" xmlns:w14="http://schemas.microsoft.com/office/word/2010/wordml" xmlns:w15="http://schemas.microsoft.com/office/word/2012/wordml" xmlns:w16cex="http://schemas.microsoft.com/office/word/2018/wordml/cex" xmlns:w16cid="http://schemas.microsoft.com/office/word/2016/wordml/cid" xmlns:w16="http://schemas.microsoft.com/office/word/2018/wordml" xmlns:w16sdtdh="http://schemas.microsoft.com/office/word/2020/wordml/sdtdatahash" xmlns:w16se="http://schemas.microsoft.com/office/word/2015/wordml/symex" xmlns:wpg="http://schemas.microsoft.com/office/word/2010/wordprocessingGroup" xmlns:wpi="http://schemas.microsoft.com/office/word/2010/wordprocessingInk" xmlns:wne="http://schemas.microsoft.com/office/word/2006/wordml" xmlns:wps="http://schemas.microsoft.com/office/word/2010/wordprocessingShape" mc:Ignorable="w14 w15 w16se w16cid w16 w16cex w16sdtdh wp14">
+<w:document xmlns:wpc="http://schemas.microsoft.com/office/word/2010/wordprocessingCanvas" xmlns:mc="http://schemas.openxmlformats.org/markup-compatibility/2006" xmlns:o="urn:schemas-microsoft-com:office:office" xmlns:r="http://schemas.openxmlformats.org/officeDocument/2006/relationships" xmlns:m="http://schemas.openxmlformats.org/officeDocument/2006/math" xmlns:v="urn:schemas-microsoft-com:vml" xmlns:wp14="http://schemas.microsoft.com/office/word/2010/wordprocessingDrawing" xmlns:wp="http://schemas.openxmlformats.org/drawingml/2006/wordprocessingDrawing" xmlns:w10="urn:schemas-microsoft-com:office:word" xmlns:w="http://schemas.openxmlformats.org/wordprocessingml/2006/main" xmlns:w14="http://schemas.microsoft.com/office/word/2010/wordml" xmlns:w15="http://schemas.microsoft.com/office/word/2012/wordml" xmlns:wpg="http://schemas.microsoft.com/office/word/2010/wordprocessingGroup" xmlns:wpi="http://schemas.microsoft.com/office/word/2010/wordprocessingInk" xmlns:wne="http://schemas.microsoft.com/office/word/2006/wordml" xmlns:wps="http://schemas.microsoft.com/office/word/2010/wordprocessingShape" mc:Ignorable="w14 w15 wp14">
   <w:body>
     <w:p>
       <w:pPr>
@@ -627,7 +627,15 @@
         <w:pStyle w:val="Heading1"/>
       </w:pPr>
       <w:r>
-        <w:t>2. Overseas Office</w:t>
+        <w:t xml:space="preserve">2. </w:t>
+      </w:r>
+      <w:r>
+        <w:t xml:space="preserve">Head </w:t>
+      </w:r>
+      <w:bookmarkStart w:id="0" w:name="_GoBack"/>
+      <w:bookmarkEnd w:id="0"/>
+      <w:r>
+        <w:t>Office</w:t>
       </w:r>
     </w:p>
     <w:p/>
@@ -1484,7 +1492,6 @@
                 <w:sz w:val="20"/>
                 <w:szCs w:val="20"/>
               </w:rPr>
-              <w:lastRenderedPageBreak/>
               <w:t>Email</w:t>
             </w:r>
           </w:p>
@@ -1550,6 +1557,7 @@
                 <w:sz w:val="20"/>
                 <w:szCs w:val="20"/>
               </w:rPr>
+              <w:lastRenderedPageBreak/>
               <w:t>Proudction</w:t>
             </w:r>
             <w:proofErr w:type="spellEnd"/>
@@ -1575,7 +1583,7 @@
           <w:p>
             <w:pPr>
               <w:rPr>
-                <w:rFonts w:ascii="Meiryo" w:eastAsia="Meiryo" w:hAnsi="Meiryo" w:hint="eastAsia"/>
+                <w:rFonts w:ascii="Meiryo" w:eastAsia="Meiryo" w:hAnsi="Meiryo"/>
                 <w:color w:val="000000"/>
                 <w:sz w:val="21"/>
                 <w:szCs w:val="21"/>
@@ -2808,7 +2816,23 @@
         <w:t>📍</w:t>
       </w:r>
       <w:r>
-        <w:t xml:space="preserve"> Panduan Lokasi Area </w:t>
+        <w:t xml:space="preserve"> </w:t>
+      </w:r>
+      <w:proofErr w:type="spellStart"/>
+      <w:r>
+        <w:t>Panduan</w:t>
+      </w:r>
+      <w:proofErr w:type="spellEnd"/>
+      <w:r>
+        <w:t xml:space="preserve"> </w:t>
+      </w:r>
+      <w:proofErr w:type="spellStart"/>
+      <w:r>
+        <w:t>Lokasi</w:t>
+      </w:r>
+      <w:proofErr w:type="spellEnd"/>
+      <w:r>
+        <w:t xml:space="preserve"> Area </w:t>
       </w:r>
       <w:proofErr w:type="spellStart"/>
       <w:r>
@@ -2830,7 +2854,7 @@
     <w:p>
       <w:r>
         <w:pict w14:anchorId="23F4E3C6">
-          <v:rect id="_x0000_i1073" style="width:0;height:1.5pt" o:hralign="center" o:hrstd="t" o:hr="t" fillcolor="#a0a0a0" stroked="f"/>
+          <v:rect id="_x0000_i1025" style="width:0;height:1.5pt" o:hralign="center" o:hrstd="t" o:hr="t" fillcolor="#a0a0a0" stroked="f"/>
         </w:pict>
       </w:r>
     </w:p>
@@ -2845,7 +2869,15 @@
         <w:t>🏢</w:t>
       </w:r>
       <w:r>
-        <w:t xml:space="preserve"> Gambaran </w:t>
+        <w:t xml:space="preserve"> </w:t>
+      </w:r>
+      <w:proofErr w:type="spellStart"/>
+      <w:r>
+        <w:t>Gambaran</w:t>
+      </w:r>
+      <w:proofErr w:type="spellEnd"/>
+      <w:r>
+        <w:t xml:space="preserve"> </w:t>
       </w:r>
       <w:proofErr w:type="spellStart"/>
       <w:r>
@@ -2853,8 +2885,13 @@
       </w:r>
       <w:proofErr w:type="spellEnd"/>
       <w:r>
-        <w:t xml:space="preserve"> Area Masuk</w:t>
-      </w:r>
+        <w:t xml:space="preserve"> Area </w:t>
+      </w:r>
+      <w:proofErr w:type="spellStart"/>
+      <w:r>
+        <w:t>Masuk</w:t>
+      </w:r>
+      <w:proofErr w:type="spellEnd"/>
     </w:p>
     <w:p/>
     <w:p>
@@ -2893,11 +2930,19 @@
       <w:r>
         <w:t xml:space="preserve"> </w:t>
       </w:r>
-      <w:r>
-        <w:rPr>
-          <w:rStyle w:val="Strong"/>
-        </w:rPr>
-        <w:t xml:space="preserve">pos </w:t>
+      <w:proofErr w:type="spellStart"/>
+      <w:r>
+        <w:rPr>
+          <w:rStyle w:val="Strong"/>
+        </w:rPr>
+        <w:t>pos</w:t>
+      </w:r>
+      <w:proofErr w:type="spellEnd"/>
+      <w:r>
+        <w:rPr>
+          <w:rStyle w:val="Strong"/>
+        </w:rPr>
+        <w:t xml:space="preserve"> </w:t>
       </w:r>
       <w:proofErr w:type="spellStart"/>
       <w:r>
@@ -3018,7 +3063,15 @@
       </w:r>
       <w:proofErr w:type="spellEnd"/>
       <w:r>
-        <w:t xml:space="preserve"> → Gedung office (</w:t>
+        <w:t xml:space="preserve"> → </w:t>
+      </w:r>
+      <w:proofErr w:type="spellStart"/>
+      <w:r>
+        <w:t>Gedung</w:t>
+      </w:r>
+      <w:proofErr w:type="spellEnd"/>
+      <w:r>
+        <w:t xml:space="preserve"> office (</w:t>
       </w:r>
       <w:proofErr w:type="spellStart"/>
       <w:r>
@@ -3184,7 +3237,15 @@
         <w:spacing w:before="100" w:beforeAutospacing="1" w:after="100" w:afterAutospacing="1"/>
       </w:pPr>
       <w:r>
-        <w:t xml:space="preserve">Masjid dan </w:t>
+        <w:t xml:space="preserve">Masjid </w:t>
+      </w:r>
+      <w:proofErr w:type="spellStart"/>
+      <w:r>
+        <w:t>dan</w:t>
+      </w:r>
+      <w:proofErr w:type="spellEnd"/>
+      <w:r>
+        <w:t xml:space="preserve"> </w:t>
       </w:r>
       <w:proofErr w:type="spellStart"/>
       <w:r>
@@ -3192,7 +3253,15 @@
       </w:r>
       <w:proofErr w:type="spellEnd"/>
       <w:r>
-        <w:t xml:space="preserve"> masing-masing </w:t>
+        <w:t xml:space="preserve"> </w:t>
+      </w:r>
+      <w:proofErr w:type="spellStart"/>
+      <w:r>
+        <w:t>masing-masing</w:t>
+      </w:r>
+      <w:proofErr w:type="spellEnd"/>
+      <w:r>
+        <w:t xml:space="preserve"> </w:t>
       </w:r>
       <w:proofErr w:type="spellStart"/>
       <w:r>
@@ -3215,7 +3284,7 @@
     <w:p>
       <w:r>
         <w:pict w14:anchorId="7D189DF8">
-          <v:rect id="_x0000_i1077" style="width:0;height:1.5pt" o:hralign="center" o:hrstd="t" o:hr="t" fillcolor="#a0a0a0" stroked="f"/>
+          <v:rect id="_x0000_i1026" style="width:0;height:1.5pt" o:hralign="center" o:hrstd="t" o:hr="t" fillcolor="#a0a0a0" stroked="f"/>
         </w:pict>
       </w:r>
     </w:p>
@@ -3238,8 +3307,13 @@
       </w:r>
       <w:proofErr w:type="spellEnd"/>
       <w:r>
-        <w:t xml:space="preserve"> Utama</w:t>
-      </w:r>
+        <w:t xml:space="preserve"> </w:t>
+      </w:r>
+      <w:proofErr w:type="spellStart"/>
+      <w:r>
+        <w:t>Utama</w:t>
+      </w:r>
+      <w:proofErr w:type="spellEnd"/>
     </w:p>
     <w:p>
       <w:pPr>
@@ -3440,7 +3514,21 @@
         <w:rPr>
           <w:rStyle w:val="Strong"/>
         </w:rPr>
-        <w:t>Warehouse (Gudang)</w:t>
+        <w:t>Warehouse (</w:t>
+      </w:r>
+      <w:proofErr w:type="spellStart"/>
+      <w:r>
+        <w:rPr>
+          <w:rStyle w:val="Strong"/>
+        </w:rPr>
+        <w:t>Gudang</w:t>
+      </w:r>
+      <w:proofErr w:type="spellEnd"/>
+      <w:r>
+        <w:rPr>
+          <w:rStyle w:val="Strong"/>
+        </w:rPr>
+        <w:t>)</w:t>
       </w:r>
       <w:r>
         <w:t xml:space="preserve"> </w:t>
@@ -3532,7 +3620,7 @@
     <w:p>
       <w:r>
         <w:pict w14:anchorId="34713791">
-          <v:rect id="_x0000_i1078" style="width:0;height:1.5pt" o:hralign="center" o:hrstd="t" o:hr="t" fillcolor="#a0a0a0" stroked="f"/>
+          <v:rect id="_x0000_i1027" style="width:0;height:1.5pt" o:hralign="center" o:hrstd="t" o:hr="t" fillcolor="#a0a0a0" stroked="f"/>
         </w:pict>
       </w:r>
     </w:p>
@@ -3684,7 +3772,21 @@
         <w:rPr>
           <w:rStyle w:val="Strong"/>
         </w:rPr>
-        <w:t xml:space="preserve"> dan </w:t>
+        <w:t xml:space="preserve"> </w:t>
+      </w:r>
+      <w:proofErr w:type="spellStart"/>
+      <w:r>
+        <w:rPr>
+          <w:rStyle w:val="Strong"/>
+        </w:rPr>
+        <w:t>dan</w:t>
+      </w:r>
+      <w:proofErr w:type="spellEnd"/>
+      <w:r>
+        <w:rPr>
+          <w:rStyle w:val="Strong"/>
+        </w:rPr>
+        <w:t xml:space="preserve"> </w:t>
       </w:r>
       <w:proofErr w:type="spellStart"/>
       <w:r>
@@ -3915,7 +4017,7 @@
     <w:p>
       <w:r>
         <w:pict w14:anchorId="766D94E8">
-          <v:rect id="_x0000_i1079" style="width:0;height:1.5pt" o:hralign="center" o:hrstd="t" o:hr="t" fillcolor="#a0a0a0" stroked="f"/>
+          <v:rect id="_x0000_i1028" style="width:0;height:1.5pt" o:hralign="center" o:hrstd="t" o:hr="t" fillcolor="#a0a0a0" stroked="f"/>
         </w:pict>
       </w:r>
     </w:p>
@@ -3990,8 +4092,13 @@
         </w:numPr>
         <w:spacing w:before="100" w:beforeAutospacing="1" w:after="100" w:afterAutospacing="1"/>
       </w:pPr>
-      <w:r>
-        <w:t xml:space="preserve">Jika </w:t>
+      <w:proofErr w:type="spellStart"/>
+      <w:r>
+        <w:t>Jika</w:t>
+      </w:r>
+      <w:proofErr w:type="spellEnd"/>
+      <w:r>
+        <w:t xml:space="preserve"> </w:t>
       </w:r>
       <w:proofErr w:type="spellStart"/>
       <w:r>
@@ -4075,7 +4182,7 @@
     <w:p>
       <w:r>
         <w:pict w14:anchorId="64F68350">
-          <v:rect id="_x0000_i1080" style="width:0;height:1.5pt" o:hralign="center" o:hrstd="t" o:hr="t" fillcolor="#a0a0a0" stroked="f"/>
+          <v:rect id="_x0000_i1029" style="width:0;height:1.5pt" o:hralign="center" o:hrstd="t" o:hr="t" fillcolor="#a0a0a0" stroked="f"/>
         </w:pict>
       </w:r>
     </w:p>
@@ -4141,8 +4248,13 @@
         </w:numPr>
         <w:spacing w:before="100" w:beforeAutospacing="1" w:after="100" w:afterAutospacing="1"/>
       </w:pPr>
-      <w:r>
-        <w:t xml:space="preserve">Jika </w:t>
+      <w:proofErr w:type="spellStart"/>
+      <w:r>
+        <w:t>Jika</w:t>
+      </w:r>
+      <w:proofErr w:type="spellEnd"/>
+      <w:r>
+        <w:t xml:space="preserve"> </w:t>
       </w:r>
       <w:proofErr w:type="spellStart"/>
       <w:r>
@@ -4226,7 +4338,7 @@
     <w:p>
       <w:r>
         <w:pict w14:anchorId="601877CA">
-          <v:rect id="_x0000_i1081" style="width:0;height:1.5pt" o:hralign="center" o:hrstd="t" o:hr="t" fillcolor="#a0a0a0" stroked="f"/>
+          <v:rect id="_x0000_i1030" style="width:0;height:1.5pt" o:hralign="center" o:hrstd="t" o:hr="t" fillcolor="#a0a0a0" stroked="f"/>
         </w:pict>
       </w:r>
     </w:p>
@@ -4280,8 +4392,13 @@
         </w:numPr>
         <w:spacing w:before="100" w:beforeAutospacing="1" w:after="100" w:afterAutospacing="1"/>
       </w:pPr>
-      <w:r>
-        <w:t xml:space="preserve">Jalan </w:t>
+      <w:proofErr w:type="spellStart"/>
+      <w:r>
+        <w:t>Jalan</w:t>
+      </w:r>
+      <w:proofErr w:type="spellEnd"/>
+      <w:r>
+        <w:t xml:space="preserve"> </w:t>
       </w:r>
       <w:proofErr w:type="spellStart"/>
       <w:r>
@@ -4509,8 +4626,13 @@
         </w:numPr>
         <w:spacing w:before="100" w:beforeAutospacing="1" w:after="100" w:afterAutospacing="1"/>
       </w:pPr>
-      <w:r>
-        <w:t xml:space="preserve">Jalan </w:t>
+      <w:proofErr w:type="spellStart"/>
+      <w:r>
+        <w:t>Jalan</w:t>
+      </w:r>
+      <w:proofErr w:type="spellEnd"/>
+      <w:r>
+        <w:t xml:space="preserve"> </w:t>
       </w:r>
       <w:proofErr w:type="spellStart"/>
       <w:r>
@@ -4564,7 +4686,7 @@
     <w:p>
       <w:r>
         <w:pict w14:anchorId="25B87785">
-          <v:rect id="_x0000_i1082" style="width:0;height:1.5pt" o:hralign="center" o:hrstd="t" o:hr="t" fillcolor="#a0a0a0" stroked="f"/>
+          <v:rect id="_x0000_i1031" style="width:0;height:1.5pt" o:hralign="center" o:hrstd="t" o:hr="t" fillcolor="#a0a0a0" stroked="f"/>
         </w:pict>
       </w:r>
     </w:p>
@@ -4673,8 +4795,13 @@
         </w:numPr>
         <w:spacing w:before="100" w:beforeAutospacing="1" w:after="100" w:afterAutospacing="1"/>
       </w:pPr>
-      <w:r>
-        <w:t xml:space="preserve">Jalan </w:t>
+      <w:proofErr w:type="spellStart"/>
+      <w:r>
+        <w:t>Jalan</w:t>
+      </w:r>
+      <w:proofErr w:type="spellEnd"/>
+      <w:r>
+        <w:t xml:space="preserve"> </w:t>
       </w:r>
       <w:proofErr w:type="spellStart"/>
       <w:r>
@@ -4776,7 +4903,7 @@
     <w:p>
       <w:r>
         <w:pict w14:anchorId="30CDFBD0">
-          <v:rect id="_x0000_i1083" style="width:0;height:1.5pt" o:hralign="center" o:hrstd="t" o:hr="t" fillcolor="#a0a0a0" stroked="f"/>
+          <v:rect id="_x0000_i1032" style="width:0;height:1.5pt" o:hralign="center" o:hrstd="t" o:hr="t" fillcolor="#a0a0a0" stroked="f"/>
         </w:pict>
       </w:r>
     </w:p>
@@ -4955,7 +5082,7 @@
     <w:p>
       <w:r>
         <w:pict w14:anchorId="694233E0">
-          <v:rect id="_x0000_i1084" style="width:0;height:1.5pt" o:hralign="center" o:hrstd="t" o:hr="t" fillcolor="#a0a0a0" stroked="f"/>
+          <v:rect id="_x0000_i1033" style="width:0;height:1.5pt" o:hralign="center" o:hrstd="t" o:hr="t" fillcolor="#a0a0a0" stroked="f"/>
         </w:pict>
       </w:r>
     </w:p>
@@ -5360,7 +5487,7 @@
 </file>
 
 <file path=word/numbering.xml><?xml version="1.0" encoding="utf-8"?>
-<w:numbering xmlns:wpc="http://schemas.microsoft.com/office/word/2010/wordprocessingCanvas" xmlns:cx="http://schemas.microsoft.com/office/drawing/2014/chartex" xmlns:cx1="http://schemas.microsoft.com/office/drawing/2015/9/8/chartex" xmlns:cx2="http://schemas.microsoft.com/office/drawing/2015/10/21/chartex" xmlns:cx3="http://schemas.microsoft.com/office/drawing/2016/5/9/chartex" xmlns:cx4="http://schemas.microsoft.com/office/drawing/2016/5/10/chartex" xmlns:cx5="http://schemas.microsoft.com/office/drawing/2016/5/11/chartex" xmlns:cx6="http://schemas.microsoft.com/office/drawing/2016/5/12/chartex" xmlns:cx7="http://schemas.microsoft.com/office/drawing/2016/5/13/chartex" xmlns:cx8="http://schemas.microsoft.com/office/drawing/2016/5/14/chartex" xmlns:mc="http://schemas.openxmlformats.org/markup-compatibility/2006" xmlns:aink="http://schemas.microsoft.com/office/drawing/2016/ink" xmlns:am3d="http://schemas.microsoft.com/office/drawing/2017/model3d" xmlns:o="urn:schemas-microsoft-com:office:office" xmlns:r="http://schemas.openxmlformats.org/officeDocument/2006/relationships" xmlns:m="http://schemas.openxmlformats.org/officeDocument/2006/math" xmlns:v="urn:schemas-microsoft-com:vml" xmlns:wp14="http://schemas.microsoft.com/office/word/2010/wordprocessingDrawing" xmlns:wp="http://schemas.openxmlformats.org/drawingml/2006/wordprocessingDrawing" xmlns:w10="urn:schemas-microsoft-com:office:word" xmlns:w="http://schemas.openxmlformats.org/wordprocessingml/2006/main" xmlns:w14="http://schemas.microsoft.com/office/word/2010/wordml" xmlns:w15="http://schemas.microsoft.com/office/word/2012/wordml" xmlns:w16cex="http://schemas.microsoft.com/office/word/2018/wordml/cex" xmlns:w16cid="http://schemas.microsoft.com/office/word/2016/wordml/cid" xmlns:w16="http://schemas.microsoft.com/office/word/2018/wordml" xmlns:w16sdtdh="http://schemas.microsoft.com/office/word/2020/wordml/sdtdatahash" xmlns:w16se="http://schemas.microsoft.com/office/word/2015/wordml/symex" xmlns:wpg="http://schemas.microsoft.com/office/word/2010/wordprocessingGroup" xmlns:wpi="http://schemas.microsoft.com/office/word/2010/wordprocessingInk" xmlns:wne="http://schemas.microsoft.com/office/word/2006/wordml" xmlns:wps="http://schemas.microsoft.com/office/word/2010/wordprocessingShape" mc:Ignorable="w14 w15 w16se w16cid w16 w16cex w16sdtdh wp14">
+<w:numbering xmlns:wpc="http://schemas.microsoft.com/office/word/2010/wordprocessingCanvas" xmlns:mc="http://schemas.openxmlformats.org/markup-compatibility/2006" xmlns:o="urn:schemas-microsoft-com:office:office" xmlns:r="http://schemas.openxmlformats.org/officeDocument/2006/relationships" xmlns:m="http://schemas.openxmlformats.org/officeDocument/2006/math" xmlns:v="urn:schemas-microsoft-com:vml" xmlns:wp14="http://schemas.microsoft.com/office/word/2010/wordprocessingDrawing" xmlns:wp="http://schemas.openxmlformats.org/drawingml/2006/wordprocessingDrawing" xmlns:w10="urn:schemas-microsoft-com:office:word" xmlns:w="http://schemas.openxmlformats.org/wordprocessingml/2006/main" xmlns:w14="http://schemas.microsoft.com/office/word/2010/wordml" xmlns:w15="http://schemas.microsoft.com/office/word/2012/wordml" xmlns:wpg="http://schemas.microsoft.com/office/word/2010/wordprocessingGroup" xmlns:wpi="http://schemas.microsoft.com/office/word/2010/wordprocessingInk" xmlns:wne="http://schemas.microsoft.com/office/word/2006/wordml" xmlns:wps="http://schemas.microsoft.com/office/word/2010/wordprocessingShape" mc:Ignorable="w14 w15 wp14">
   <w:abstractNum w:abstractNumId="0" w15:restartNumberingAfterBreak="0">
     <w:nsid w:val="2AC87A04"/>
     <w:multiLevelType w:val="multilevel"/>
@@ -7305,7 +7432,7 @@
 </file>
 
 <file path=word/styles.xml><?xml version="1.0" encoding="utf-8"?>
-<w:styles xmlns:mc="http://schemas.openxmlformats.org/markup-compatibility/2006" xmlns:r="http://schemas.openxmlformats.org/officeDocument/2006/relationships" xmlns:w="http://schemas.openxmlformats.org/wordprocessingml/2006/main" xmlns:w14="http://schemas.microsoft.com/office/word/2010/wordml" xmlns:w15="http://schemas.microsoft.com/office/word/2012/wordml" xmlns:w16cex="http://schemas.microsoft.com/office/word/2018/wordml/cex" xmlns:w16cid="http://schemas.microsoft.com/office/word/2016/wordml/cid" xmlns:w16="http://schemas.microsoft.com/office/word/2018/wordml" xmlns:w16sdtdh="http://schemas.microsoft.com/office/word/2020/wordml/sdtdatahash" xmlns:w16se="http://schemas.microsoft.com/office/word/2015/wordml/symex" mc:Ignorable="w14 w15 w16se w16cid w16 w16cex w16sdtdh">
+<w:styles xmlns:mc="http://schemas.openxmlformats.org/markup-compatibility/2006" xmlns:r="http://schemas.openxmlformats.org/officeDocument/2006/relationships" xmlns:w="http://schemas.openxmlformats.org/wordprocessingml/2006/main" xmlns:w14="http://schemas.microsoft.com/office/word/2010/wordml" xmlns:w15="http://schemas.microsoft.com/office/word/2012/wordml" mc:Ignorable="w14 w15">
   <w:docDefaults>
     <w:rPrDefault>
       <w:rPr>
@@ -7323,7 +7450,7 @@
       </w:pPr>
     </w:pPrDefault>
   </w:docDefaults>
-  <w:latentStyles w:defLockedState="0" w:defUIPriority="99" w:defSemiHidden="0" w:defUnhideWhenUsed="0" w:defQFormat="0" w:count="376">
+  <w:latentStyles w:defLockedState="0" w:defUIPriority="99" w:defSemiHidden="0" w:defUnhideWhenUsed="0" w:defQFormat="0" w:count="371">
     <w:lsdException w:name="Normal" w:uiPriority="0" w:qFormat="1"/>
     <w:lsdException w:name="heading 1" w:uiPriority="0" w:qFormat="1"/>
     <w:lsdException w:name="heading 2" w:semiHidden="1" w:uiPriority="9" w:unhideWhenUsed="1" w:qFormat="1"/>
@@ -7429,6 +7556,7 @@
     <w:lsdException w:name="HTML Sample" w:semiHidden="1" w:unhideWhenUsed="1"/>
     <w:lsdException w:name="HTML Typewriter" w:semiHidden="1" w:unhideWhenUsed="1"/>
     <w:lsdException w:name="HTML Variable" w:semiHidden="1" w:unhideWhenUsed="1"/>
+    <w:lsdException w:name="Normal Table" w:semiHidden="1" w:unhideWhenUsed="1"/>
     <w:lsdException w:name="annotation subject" w:semiHidden="1" w:unhideWhenUsed="1"/>
     <w:lsdException w:name="No List" w:semiHidden="1" w:unhideWhenUsed="1"/>
     <w:lsdException w:name="Outline List 1" w:semiHidden="1" w:unhideWhenUsed="1"/>
@@ -7471,8 +7599,11 @@
     <w:lsdException w:name="Table Contemporary" w:semiHidden="1" w:unhideWhenUsed="1"/>
     <w:lsdException w:name="Table Elegant" w:semiHidden="1" w:unhideWhenUsed="1"/>
     <w:lsdException w:name="Table Professional" w:semiHidden="1" w:unhideWhenUsed="1"/>
+    <w:lsdException w:name="Table Subtle 1" w:semiHidden="1" w:unhideWhenUsed="1"/>
     <w:lsdException w:name="Table Subtle 2" w:semiHidden="1" w:unhideWhenUsed="1"/>
     <w:lsdException w:name="Table Web 1" w:semiHidden="1" w:unhideWhenUsed="1"/>
+    <w:lsdException w:name="Table Web 2" w:semiHidden="1" w:unhideWhenUsed="1"/>
+    <w:lsdException w:name="Table Web 3" w:semiHidden="1" w:unhideWhenUsed="1"/>
     <w:lsdException w:name="Balloon Text" w:semiHidden="1" w:unhideWhenUsed="1"/>
     <w:lsdException w:name="Table Grid" w:uiPriority="39"/>
     <w:lsdException w:name="Table Theme" w:semiHidden="1" w:unhideWhenUsed="1"/>
@@ -7691,11 +7822,6 @@
     <w:lsdException w:name="List Table 5 Dark Accent 6" w:uiPriority="50"/>
     <w:lsdException w:name="List Table 6 Colorful Accent 6" w:uiPriority="51"/>
     <w:lsdException w:name="List Table 7 Colorful Accent 6" w:uiPriority="52"/>
-    <w:lsdException w:name="Mention" w:semiHidden="1" w:unhideWhenUsed="1"/>
-    <w:lsdException w:name="Smart Hyperlink" w:semiHidden="1" w:unhideWhenUsed="1"/>
-    <w:lsdException w:name="Hashtag" w:semiHidden="1" w:unhideWhenUsed="1"/>
-    <w:lsdException w:name="Unresolved Mention" w:semiHidden="1" w:unhideWhenUsed="1"/>
-    <w:lsdException w:name="Smart Link" w:semiHidden="1" w:unhideWhenUsed="1"/>
   </w:latentStyles>
   <w:style w:type="paragraph" w:default="1" w:styleId="Normal">
     <w:name w:val="Normal"/>
@@ -7810,7 +7936,7 @@
       <w:u w:val="single"/>
     </w:rPr>
   </w:style>
-  <w:style w:type="character" w:styleId="UnresolvedMention">
+  <w:style w:type="character" w:customStyle="1" w:styleId="UnresolvedMention">
     <w:name w:val="Unresolved Mention"/>
     <w:basedOn w:val="DefaultParagraphFont"/>
     <w:uiPriority w:val="99"/>

</xml_diff>